<commit_message>
Am Montag fängt das Studium an
</commit_message>
<xml_diff>
--- a/Stidenfach_THI_Sommersemster 2026.docx
+++ b/Stidenfach_THI_Sommersemster 2026.docx
@@ -131,11 +131,9 @@
       </w:r>
     </w:p>
     <w:p>
-      <w:proofErr w:type="gramStart"/>
       <w:r>
         <w:t>Email</w:t>
       </w:r>
-      <w:proofErr w:type="gramEnd"/>
       <w:r>
         <w:br/>
       </w:r>
@@ -148,18 +146,15 @@
         </w:r>
       </w:hyperlink>
       <w:r>
-        <w:t xml:space="preserve"> -&gt; </w:t>
-      </w:r>
-      <w:proofErr w:type="gramStart"/>
-      <w:r>
-        <w:t>Email</w:t>
-      </w:r>
-      <w:proofErr w:type="gramEnd"/>
-      <w:r>
-        <w:t xml:space="preserve"> schreiben für eine Bewerbung als Gaststudierenden</w:t>
+        <w:t xml:space="preserve"> -&gt; Email schreiben für eine Bewerbung als Gaststudierenden</w:t>
       </w:r>
       <w:r>
         <w:br/>
+      </w:r>
+    </w:p>
+    <w:p>
+      <w:r>
+        <w:t>Am Montag fängt das Studium an.</w:t>
       </w:r>
     </w:p>
     <w:sectPr>
@@ -776,6 +771,7 @@
   <w:style w:type="character" w:default="1" w:styleId="Absatz-Standardschriftart">
     <w:name w:val="Default Paragraph Font"/>
     <w:uiPriority w:val="1"/>
+    <w:semiHidden/>
     <w:unhideWhenUsed/>
   </w:style>
   <w:style w:type="table" w:default="1" w:styleId="NormaleTabelle">

</xml_diff>